<commit_message>
hoàn thành phiếu học tập
</commit_message>
<xml_diff>
--- a/ThucHanh2/Phiếu học tập CSS - BTTH02 - K66.docx
+++ b/ThucHanh2/Phiếu học tập CSS - BTTH02 - K66.docx
@@ -2977,6 +2977,7 @@
         <w:rPr>
           <w:rFonts w:ascii="inter" w:eastAsia="inter" w:hAnsi="inter" w:cs="inter"/>
           <w:i/>
+          <w:noProof/>
           <w:color w:val="000000"/>
         </w:rPr>
         <w:drawing>
@@ -3047,6 +3048,9 @@
         <w:spacing w:after="210" w:line="360" w:lineRule="auto"/>
       </w:pPr>
       <w:r>
+        <w:rPr>
+          <w:noProof/>
+        </w:rPr>
         <w:lastRenderedPageBreak/>
         <w:drawing>
           <wp:inline distT="0" distB="0" distL="0" distR="0" wp14:anchorId="01B645D6" wp14:editId="77E27DD8">
@@ -5092,6 +5096,11 @@
     <w:p>
       <w:pPr>
         <w:spacing w:after="210" w:line="360" w:lineRule="auto"/>
+        <w:rPr>
+          <w:rFonts w:ascii="inter" w:eastAsia="inter" w:hAnsi="inter" w:cs="inter"/>
+          <w:b/>
+          <w:color w:val="000000"/>
+        </w:rPr>
       </w:pPr>
       <w:r>
         <w:rPr>
@@ -5100,6 +5109,32 @@
           <w:color w:val="000000"/>
         </w:rPr>
         <w:t>Tài liệu đã xem (Link):</w:t>
+      </w:r>
+      <w:r>
+        <w:rPr>
+          <w:rFonts w:ascii="inter" w:eastAsia="inter" w:hAnsi="inter" w:cs="inter"/>
+          <w:b/>
+          <w:color w:val="000000"/>
+        </w:rPr>
+        <w:t xml:space="preserve"> </w:t>
+      </w:r>
+      <w:hyperlink r:id="rId10" w:history="1">
+        <w:r>
+          <w:rPr>
+            <w:rStyle w:val="Siuktni"/>
+            <w:rFonts w:ascii="inter" w:eastAsia="inter" w:hAnsi="inter" w:cs="inter"/>
+            <w:b/>
+          </w:rPr>
+          <w:t>https://www.w3schools.com/css/css3_flexbox.asp</w:t>
+        </w:r>
+      </w:hyperlink>
+    </w:p>
+    <w:p>
+      <w:pPr>
+        <w:spacing w:after="210" w:line="360" w:lineRule="auto"/>
+      </w:pPr>
+      <w:r>
+        <w:t>https://www.w3schools.com/css/css_grid.asp</w:t>
       </w:r>
     </w:p>
     <w:p>
@@ -5146,9 +5181,9 @@
         <w:tblLook w:val="04A0" w:firstRow="1" w:lastRow="0" w:firstColumn="1" w:lastColumn="0" w:noHBand="0" w:noVBand="1"/>
       </w:tblPr>
       <w:tblGrid>
-        <w:gridCol w:w="1649"/>
-        <w:gridCol w:w="2487"/>
-        <w:gridCol w:w="2593"/>
+        <w:gridCol w:w="1364"/>
+        <w:gridCol w:w="4034"/>
+        <w:gridCol w:w="4106"/>
       </w:tblGrid>
       <w:tr>
         <w:trPr>
@@ -5278,7 +5313,7 @@
                 <w:color w:val="000000"/>
                 <w:sz w:val="17"/>
               </w:rPr>
-              <w:t>(Tự điền: 1 chiều hay 2 chiều?)</w:t>
+              <w:t>1 chiều</w:t>
             </w:r>
           </w:p>
         </w:tc>
@@ -5301,7 +5336,7 @@
                 <w:color w:val="000000"/>
                 <w:sz w:val="17"/>
               </w:rPr>
-              <w:t>(Tự điền: 1 chiều hay 2 chiều?)</w:t>
+              <w:t>2 chiều</w:t>
             </w:r>
           </w:p>
         </w:tc>
@@ -5356,7 +5391,7 @@
                 <w:color w:val="000000"/>
                 <w:sz w:val="17"/>
               </w:rPr>
-              <w:t>(Tự điền)</w:t>
+              <w:t>Sắp xếp các thành phần nhỏ (Menu, căn giữa item, thanh điều hướng)</w:t>
             </w:r>
           </w:p>
         </w:tc>
@@ -5379,7 +5414,7 @@
                 <w:color w:val="000000"/>
                 <w:sz w:val="17"/>
               </w:rPr>
-              <w:t>(Tự điền)</w:t>
+              <w:t>Xây dựng cấu trúc tổng thể trang web (Layout lớn, thư viện ảnh phức tạp)</w:t>
             </w:r>
           </w:p>
         </w:tc>
@@ -5467,6 +5502,25 @@
               </w:rPr>
               <w:t>align-items</w:t>
             </w:r>
+            <w:r>
+              <w:rPr>
+                <w:rStyle w:val="VerbatimChar"/>
+                <w:rFonts w:ascii="IBM Plex Mono" w:eastAsia="IBM Plex Mono" w:hAnsi="IBM Plex Mono" w:cs="IBM Plex Mono"/>
+                <w:color w:val="000000"/>
+                <w:sz w:val="18"/>
+                <w:shd w:val="clear" w:color="auto" w:fill="F8F8FA"/>
+              </w:rPr>
+              <w:t xml:space="preserve">, </w:t>
+            </w:r>
+            <w:r>
+              <w:rPr>
+                <w:rFonts w:ascii="IBM Plex Mono" w:eastAsia="IBM Plex Mono" w:hAnsi="IBM Plex Mono" w:cs="IBM Plex Mono"/>
+                <w:color w:val="000000"/>
+                <w:sz w:val="18"/>
+                <w:shd w:val="clear" w:color="auto" w:fill="F8F8FA"/>
+              </w:rPr>
+              <w:t>flex-direction</w:t>
+            </w:r>
           </w:p>
         </w:tc>
         <w:tc>
@@ -5520,6 +5574,28 @@
                 <w:shd w:val="clear" w:color="auto" w:fill="F8F8FA"/>
               </w:rPr>
               <w:t>grid-template-rows</w:t>
+            </w:r>
+            <w:r>
+              <w:rPr>
+                <w:rStyle w:val="VerbatimChar"/>
+                <w:rFonts w:ascii="IBM Plex Mono" w:eastAsia="IBM Plex Mono" w:hAnsi="IBM Plex Mono" w:cs="IBM Plex Mono"/>
+                <w:color w:val="000000"/>
+                <w:sz w:val="18"/>
+                <w:shd w:val="clear" w:color="auto" w:fill="F8F8FA"/>
+              </w:rPr>
+              <w:t>,</w:t>
+            </w:r>
+            <w:r>
+              <w:t xml:space="preserve"> </w:t>
+            </w:r>
+            <w:r>
+              <w:rPr>
+                <w:rFonts w:ascii="IBM Plex Mono" w:eastAsia="IBM Plex Mono" w:hAnsi="IBM Plex Mono" w:cs="IBM Plex Mono"/>
+                <w:color w:val="000000"/>
+                <w:sz w:val="18"/>
+                <w:shd w:val="clear" w:color="auto" w:fill="F8F8FA"/>
+              </w:rPr>
+              <w:t>gap</w:t>
             </w:r>
           </w:p>
         </w:tc>
@@ -5568,13 +5644,37 @@
               <w:spacing w:line="360" w:lineRule="auto"/>
             </w:pPr>
             <w:r>
-              <w:rPr>
-                <w:rFonts w:ascii="inter" w:eastAsia="inter" w:hAnsi="inter" w:cs="inter"/>
-                <w:i/>
-                <w:color w:val="000000"/>
-                <w:sz w:val="17"/>
-              </w:rPr>
-              <w:t>(Tự điền)</w:t>
+              <w:t>Thanh menu ngang, c</w:t>
+            </w:r>
+            <w:r>
+              <w:t>ă</w:t>
+            </w:r>
+            <w:r>
+              <w:t>n gi</w:t>
+            </w:r>
+            <w:r>
+              <w:t>ữ</w:t>
+            </w:r>
+            <w:r>
+              <w:t>a m</w:t>
+            </w:r>
+            <w:r>
+              <w:t>ộ</w:t>
+            </w:r>
+            <w:r>
+              <w:t>t n</w:t>
+            </w:r>
+            <w:r>
+              <w:t>ú</w:t>
+            </w:r>
+            <w:r>
+              <w:t>t b</w:t>
+            </w:r>
+            <w:r>
+              <w:t>ấ</w:t>
+            </w:r>
+            <w:r>
+              <w:t>m trong khung</w:t>
             </w:r>
           </w:p>
         </w:tc>
@@ -5597,7 +5697,7 @@
                 <w:color w:val="000000"/>
                 <w:sz w:val="17"/>
               </w:rPr>
-              <w:t>(Tự điền)</w:t>
+              <w:t>Bố cục trang tin tức có Sidebar, Header, Footer và nội dung chính</w:t>
             </w:r>
           </w:p>
         </w:tc>
@@ -5633,7 +5733,6 @@
           <w:color w:val="000000"/>
           <w:sz w:val="18"/>
         </w:rPr>
-        <w:lastRenderedPageBreak/>
         <w:t>.flex-container {</w:t>
       </w:r>
       <w:r>
@@ -5987,6 +6086,7 @@
           <w:color w:val="000000"/>
           <w:sz w:val="24"/>
         </w:rPr>
+        <w:lastRenderedPageBreak/>
         <w:t>Mục tiêu:</w:t>
       </w:r>
       <w:bookmarkEnd w:id="26"/>
@@ -6020,7 +6120,6 @@
           <w:rFonts w:ascii="inter" w:eastAsia="inter" w:hAnsi="inter" w:cs="inter"/>
           <w:color w:val="000000"/>
         </w:rPr>
-        <w:lastRenderedPageBreak/>
         <w:t xml:space="preserve">Dùng Flexbox cho layout card (thay thế </w:t>
       </w:r>
       <w:r>
@@ -6393,6 +6492,15 @@
           <w:sz w:val="18"/>
         </w:rPr>
         <w:br/>
+      </w:r>
+      <w:r>
+        <w:rPr>
+          <w:rStyle w:val="VerbatimChar"/>
+          <w:rFonts w:ascii="IBM Plex Mono" w:eastAsia="IBM Plex Mono" w:hAnsi="IBM Plex Mono" w:cs="IBM Plex Mono"/>
+          <w:color w:val="000000"/>
+          <w:sz w:val="18"/>
+        </w:rPr>
+        <w:lastRenderedPageBreak/>
         <w:t>/* Responsive: Khi màn hình &lt; 768px, card chiếm full width */</w:t>
       </w:r>
       <w:r>
@@ -6433,15 +6541,6 @@
           <w:sz w:val="18"/>
         </w:rPr>
         <w:br/>
-      </w:r>
-      <w:r>
-        <w:rPr>
-          <w:rStyle w:val="VerbatimChar"/>
-          <w:rFonts w:ascii="IBM Plex Mono" w:eastAsia="IBM Plex Mono" w:hAnsi="IBM Plex Mono" w:cs="IBM Plex Mono"/>
-          <w:color w:val="000000"/>
-          <w:sz w:val="18"/>
-        </w:rPr>
-        <w:lastRenderedPageBreak/>
         <w:t xml:space="preserve">    }</w:t>
       </w:r>
       <w:r>
@@ -6585,29 +6684,128 @@
     <w:p>
       <w:pPr>
         <w:spacing w:after="210" w:line="360" w:lineRule="auto"/>
-      </w:pPr>
-      <w:r>
         <w:rPr>
           <w:rFonts w:ascii="inter" w:eastAsia="inter" w:hAnsi="inter" w:cs="inter"/>
           <w:i/>
           <w:color w:val="000000"/>
         </w:rPr>
+      </w:pPr>
+      <w:r>
+        <w:rPr>
+          <w:rFonts w:ascii="inter" w:eastAsia="inter" w:hAnsi="inter" w:cs="inter"/>
+          <w:i/>
+          <w:color w:val="000000"/>
+        </w:rPr>
         <w:t>(Dán ảnh 1: Desktop view - 3 card ngang)</w:t>
       </w:r>
-      <w:r>
-        <w:rPr>
-          <w:rFonts w:ascii="inter" w:eastAsia="inter" w:hAnsi="inter" w:cs="inter"/>
-          <w:color w:val="000000"/>
-        </w:rPr>
-        <w:br/>
-      </w:r>
-      <w:r>
+    </w:p>
+    <w:p>
+      <w:pPr>
+        <w:spacing w:after="210" w:line="360" w:lineRule="auto"/>
         <w:rPr>
           <w:rFonts w:ascii="inter" w:eastAsia="inter" w:hAnsi="inter" w:cs="inter"/>
           <w:i/>
           <w:color w:val="000000"/>
         </w:rPr>
+      </w:pPr>
+      <w:r>
+        <w:rPr>
+          <w:rFonts w:ascii="inter" w:eastAsia="inter" w:hAnsi="inter" w:cs="inter"/>
+          <w:color w:val="000000"/>
+        </w:rPr>
+        <w:drawing>
+          <wp:inline distT="0" distB="0" distL="0" distR="0" wp14:anchorId="5782C99F" wp14:editId="041D59B8">
+            <wp:extent cx="6038850" cy="3395345"/>
+            <wp:effectExtent l="0" t="0" r="0" b="0"/>
+            <wp:docPr id="371538656" name="Hình ảnh 1" descr="Ảnh có chứa văn bản, phần mềm, ảnh chụp màn hình, Biểu tượng máy tính&#10;&#10;Nội dung do AI tạo ra có thể không chính xác."/>
+            <wp:cNvGraphicFramePr>
+              <a:graphicFrameLocks xmlns:a="http://schemas.openxmlformats.org/drawingml/2006/main" noChangeAspect="1"/>
+            </wp:cNvGraphicFramePr>
+            <a:graphic xmlns:a="http://schemas.openxmlformats.org/drawingml/2006/main">
+              <a:graphicData uri="http://schemas.openxmlformats.org/drawingml/2006/picture">
+                <pic:pic xmlns:pic="http://schemas.openxmlformats.org/drawingml/2006/picture">
+                  <pic:nvPicPr>
+                    <pic:cNvPr id="371538656" name="Hình ảnh 1" descr="Ảnh có chứa văn bản, phần mềm, ảnh chụp màn hình, Biểu tượng máy tính&#10;&#10;Nội dung do AI tạo ra có thể không chính xác."/>
+                    <pic:cNvPicPr/>
+                  </pic:nvPicPr>
+                  <pic:blipFill>
+                    <a:blip r:embed="rId11"/>
+                    <a:stretch>
+                      <a:fillRect/>
+                    </a:stretch>
+                  </pic:blipFill>
+                  <pic:spPr>
+                    <a:xfrm>
+                      <a:off x="0" y="0"/>
+                      <a:ext cx="6038850" cy="3395345"/>
+                    </a:xfrm>
+                    <a:prstGeom prst="rect">
+                      <a:avLst/>
+                    </a:prstGeom>
+                  </pic:spPr>
+                </pic:pic>
+              </a:graphicData>
+            </a:graphic>
+          </wp:inline>
+        </w:drawing>
+      </w:r>
+      <w:r>
+        <w:rPr>
+          <w:rFonts w:ascii="inter" w:eastAsia="inter" w:hAnsi="inter" w:cs="inter"/>
+          <w:color w:val="000000"/>
+        </w:rPr>
+        <w:br/>
+      </w:r>
+      <w:r>
+        <w:rPr>
+          <w:rFonts w:ascii="inter" w:eastAsia="inter" w:hAnsi="inter" w:cs="inter"/>
+          <w:i/>
+          <w:color w:val="000000"/>
+        </w:rPr>
         <w:t>(Dán ảnh 2: Mobile view - card xếp dọc)</w:t>
+      </w:r>
+    </w:p>
+    <w:p>
+      <w:pPr>
+        <w:spacing w:after="210" w:line="360" w:lineRule="auto"/>
+      </w:pPr>
+      <w:r>
+        <w:lastRenderedPageBreak/>
+        <w:drawing>
+          <wp:inline distT="0" distB="0" distL="0" distR="0" wp14:anchorId="4DE860DD" wp14:editId="3199F569">
+            <wp:extent cx="6038850" cy="3395345"/>
+            <wp:effectExtent l="0" t="0" r="0" b="0"/>
+            <wp:docPr id="50013668" name="Hình ảnh 1" descr="Ảnh có chứa văn bản, ảnh chụp màn hình, phần mềm, Biểu tượng máy tính&#10;&#10;Nội dung do AI tạo ra có thể không chính xác."/>
+            <wp:cNvGraphicFramePr>
+              <a:graphicFrameLocks xmlns:a="http://schemas.openxmlformats.org/drawingml/2006/main" noChangeAspect="1"/>
+            </wp:cNvGraphicFramePr>
+            <a:graphic xmlns:a="http://schemas.openxmlformats.org/drawingml/2006/main">
+              <a:graphicData uri="http://schemas.openxmlformats.org/drawingml/2006/picture">
+                <pic:pic xmlns:pic="http://schemas.openxmlformats.org/drawingml/2006/picture">
+                  <pic:nvPicPr>
+                    <pic:cNvPr id="50013668" name="Hình ảnh 1" descr="Ảnh có chứa văn bản, ảnh chụp màn hình, phần mềm, Biểu tượng máy tính&#10;&#10;Nội dung do AI tạo ra có thể không chính xác."/>
+                    <pic:cNvPicPr/>
+                  </pic:nvPicPr>
+                  <pic:blipFill>
+                    <a:blip r:embed="rId12"/>
+                    <a:stretch>
+                      <a:fillRect/>
+                    </a:stretch>
+                  </pic:blipFill>
+                  <pic:spPr>
+                    <a:xfrm>
+                      <a:off x="0" y="0"/>
+                      <a:ext cx="6038850" cy="3395345"/>
+                    </a:xfrm>
+                    <a:prstGeom prst="rect">
+                      <a:avLst/>
+                    </a:prstGeom>
+                  </pic:spPr>
+                </pic:pic>
+              </a:graphicData>
+            </a:graphic>
+          </wp:inline>
+        </w:drawing>
       </w:r>
     </w:p>
     <w:p>
@@ -6831,7 +7029,6 @@
           <w:color w:val="000000"/>
           <w:sz w:val="24"/>
         </w:rPr>
-        <w:lastRenderedPageBreak/>
         <w:t>Yêu cầu CSS:</w:t>
       </w:r>
       <w:bookmarkEnd w:id="32"/>
@@ -6848,6 +7045,7 @@
           <w:color w:val="000000"/>
           <w:sz w:val="18"/>
         </w:rPr>
+        <w:lastRenderedPageBreak/>
         <w:t>.gallery {</w:t>
       </w:r>
       <w:r>
@@ -7190,7 +7388,14 @@
           <w:rFonts w:ascii="inter" w:eastAsia="inter" w:hAnsi="inter" w:cs="inter"/>
           <w:color w:val="000000"/>
         </w:rPr>
-        <w:t>: ________________________________</w:t>
+        <w:t xml:space="preserve">: </w:t>
+      </w:r>
+      <w:r>
+        <w:rPr>
+          <w:rFonts w:ascii="inter" w:eastAsia="inter" w:hAnsi="inter" w:cs="inter"/>
+          <w:color w:val="000000"/>
+        </w:rPr>
+        <w:t>định nghĩa cột/hàng mà không cần viết thủ công từng cái.</w:t>
       </w:r>
     </w:p>
     <w:p>
@@ -7216,7 +7421,17 @@
           <w:rFonts w:ascii="inter" w:eastAsia="inter" w:hAnsi="inter" w:cs="inter"/>
           <w:color w:val="000000"/>
         </w:rPr>
-        <w:t>: ________________________________</w:t>
+        <w:t>:</w:t>
+      </w:r>
+      <w:r>
+        <w:t xml:space="preserve"> </w:t>
+      </w:r>
+      <w:r>
+        <w:rPr>
+          <w:rFonts w:ascii="inter" w:eastAsia="inter" w:hAnsi="inter" w:cs="inter"/>
+          <w:color w:val="000000"/>
+        </w:rPr>
+        <w:t>Tự động tính toán số lượng cột dựa trên không gian trống của container.</w:t>
       </w:r>
     </w:p>
     <w:p>
@@ -7242,7 +7457,17 @@
           <w:rFonts w:ascii="inter" w:eastAsia="inter" w:hAnsi="inter" w:cs="inter"/>
           <w:color w:val="000000"/>
         </w:rPr>
-        <w:t>: ________________________________</w:t>
+        <w:t>:</w:t>
+      </w:r>
+      <w:r>
+        <w:t xml:space="preserve"> </w:t>
+      </w:r>
+      <w:r>
+        <w:rPr>
+          <w:rFonts w:ascii="inter" w:eastAsia="inter" w:hAnsi="inter" w:cs="inter"/>
+          <w:color w:val="000000"/>
+        </w:rPr>
+        <w:t>Đảm bảo mỗi cột có độ rộng tối thiểu là 200px và tối đa là 1 phần (1fr) của không gian còn lại.</w:t>
       </w:r>
     </w:p>
     <w:p>
@@ -7327,29 +7552,128 @@
     <w:p>
       <w:pPr>
         <w:spacing w:after="210" w:line="360" w:lineRule="auto"/>
-      </w:pPr>
-      <w:r>
         <w:rPr>
           <w:rFonts w:ascii="inter" w:eastAsia="inter" w:hAnsi="inter" w:cs="inter"/>
           <w:i/>
           <w:color w:val="000000"/>
         </w:rPr>
+      </w:pPr>
+      <w:r>
+        <w:rPr>
+          <w:rFonts w:ascii="inter" w:eastAsia="inter" w:hAnsi="inter" w:cs="inter"/>
+          <w:i/>
+          <w:color w:val="000000"/>
+        </w:rPr>
         <w:t>(Dán ảnh 1: Desktop - 3 cột)</w:t>
       </w:r>
-      <w:r>
-        <w:rPr>
-          <w:rFonts w:ascii="inter" w:eastAsia="inter" w:hAnsi="inter" w:cs="inter"/>
-          <w:color w:val="000000"/>
-        </w:rPr>
-        <w:br/>
-      </w:r>
-      <w:r>
+    </w:p>
+    <w:p>
+      <w:pPr>
+        <w:spacing w:after="210" w:line="360" w:lineRule="auto"/>
         <w:rPr>
           <w:rFonts w:ascii="inter" w:eastAsia="inter" w:hAnsi="inter" w:cs="inter"/>
           <w:i/>
           <w:color w:val="000000"/>
         </w:rPr>
+      </w:pPr>
+      <w:r>
+        <w:rPr>
+          <w:rFonts w:ascii="inter" w:eastAsia="inter" w:hAnsi="inter" w:cs="inter"/>
+          <w:color w:val="000000"/>
+        </w:rPr>
+        <w:drawing>
+          <wp:inline distT="0" distB="0" distL="0" distR="0" wp14:anchorId="397DEE40" wp14:editId="049AD75A">
+            <wp:extent cx="6038850" cy="3395345"/>
+            <wp:effectExtent l="0" t="0" r="0" b="0"/>
+            <wp:docPr id="1354892809" name="Hình ảnh 1"/>
+            <wp:cNvGraphicFramePr>
+              <a:graphicFrameLocks xmlns:a="http://schemas.openxmlformats.org/drawingml/2006/main" noChangeAspect="1"/>
+            </wp:cNvGraphicFramePr>
+            <a:graphic xmlns:a="http://schemas.openxmlformats.org/drawingml/2006/main">
+              <a:graphicData uri="http://schemas.openxmlformats.org/drawingml/2006/picture">
+                <pic:pic xmlns:pic="http://schemas.openxmlformats.org/drawingml/2006/picture">
+                  <pic:nvPicPr>
+                    <pic:cNvPr id="1354892809" name=""/>
+                    <pic:cNvPicPr/>
+                  </pic:nvPicPr>
+                  <pic:blipFill>
+                    <a:blip r:embed="rId13"/>
+                    <a:stretch>
+                      <a:fillRect/>
+                    </a:stretch>
+                  </pic:blipFill>
+                  <pic:spPr>
+                    <a:xfrm>
+                      <a:off x="0" y="0"/>
+                      <a:ext cx="6038850" cy="3395345"/>
+                    </a:xfrm>
+                    <a:prstGeom prst="rect">
+                      <a:avLst/>
+                    </a:prstGeom>
+                  </pic:spPr>
+                </pic:pic>
+              </a:graphicData>
+            </a:graphic>
+          </wp:inline>
+        </w:drawing>
+      </w:r>
+      <w:r>
+        <w:rPr>
+          <w:rFonts w:ascii="inter" w:eastAsia="inter" w:hAnsi="inter" w:cs="inter"/>
+          <w:color w:val="000000"/>
+        </w:rPr>
+        <w:br/>
+      </w:r>
+      <w:r>
+        <w:rPr>
+          <w:rFonts w:ascii="inter" w:eastAsia="inter" w:hAnsi="inter" w:cs="inter"/>
+          <w:i/>
+          <w:color w:val="000000"/>
+        </w:rPr>
         <w:t>(Dán ảnh 2: Mobile - 1 cột)</w:t>
+      </w:r>
+    </w:p>
+    <w:p>
+      <w:pPr>
+        <w:spacing w:after="210" w:line="360" w:lineRule="auto"/>
+      </w:pPr>
+      <w:r>
+        <w:lastRenderedPageBreak/>
+        <w:drawing>
+          <wp:inline distT="0" distB="0" distL="0" distR="0" wp14:anchorId="5661654D" wp14:editId="3EEF4D0B">
+            <wp:extent cx="6038850" cy="3399155"/>
+            <wp:effectExtent l="0" t="0" r="0" b="0"/>
+            <wp:docPr id="87710526" name="Hình ảnh 1" descr="Ảnh có chứa văn bản, ảnh chụp màn hình, phần mềm, Biểu tượng máy tính&#10;&#10;Nội dung do AI tạo ra có thể không chính xác."/>
+            <wp:cNvGraphicFramePr>
+              <a:graphicFrameLocks xmlns:a="http://schemas.openxmlformats.org/drawingml/2006/main" noChangeAspect="1"/>
+            </wp:cNvGraphicFramePr>
+            <a:graphic xmlns:a="http://schemas.openxmlformats.org/drawingml/2006/main">
+              <a:graphicData uri="http://schemas.openxmlformats.org/drawingml/2006/picture">
+                <pic:pic xmlns:pic="http://schemas.openxmlformats.org/drawingml/2006/picture">
+                  <pic:nvPicPr>
+                    <pic:cNvPr id="87710526" name="Hình ảnh 1" descr="Ảnh có chứa văn bản, ảnh chụp màn hình, phần mềm, Biểu tượng máy tính&#10;&#10;Nội dung do AI tạo ra có thể không chính xác."/>
+                    <pic:cNvPicPr/>
+                  </pic:nvPicPr>
+                  <pic:blipFill>
+                    <a:blip r:embed="rId14"/>
+                    <a:stretch>
+                      <a:fillRect/>
+                    </a:stretch>
+                  </pic:blipFill>
+                  <pic:spPr>
+                    <a:xfrm>
+                      <a:off x="0" y="0"/>
+                      <a:ext cx="6038850" cy="3399155"/>
+                    </a:xfrm>
+                    <a:prstGeom prst="rect">
+                      <a:avLst/>
+                    </a:prstGeom>
+                  </pic:spPr>
+                </pic:pic>
+              </a:graphicData>
+            </a:graphic>
+          </wp:inline>
+        </w:drawing>
       </w:r>
     </w:p>
     <w:p>
@@ -7459,8 +7783,8 @@
       </w:tblPr>
       <w:tblGrid>
         <w:gridCol w:w="1191"/>
-        <w:gridCol w:w="992"/>
-        <w:gridCol w:w="1394"/>
+        <w:gridCol w:w="6844"/>
+        <w:gridCol w:w="1469"/>
       </w:tblGrid>
       <w:tr>
         <w:trPr>
@@ -7591,7 +7915,19 @@
                 <w:color w:val="000000"/>
                 <w:sz w:val="17"/>
               </w:rPr>
-              <w:t>(Tự điền)</w:t>
+              <w:t>Giá trị mặc định.</w:t>
+            </w:r>
+            <w:r>
+              <w:t xml:space="preserve"> </w:t>
+            </w:r>
+            <w:r>
+              <w:rPr>
+                <w:rFonts w:ascii="inter" w:eastAsia="inter" w:hAnsi="inter" w:cs="inter"/>
+                <w:i/>
+                <w:color w:val="000000"/>
+                <w:sz w:val="17"/>
+              </w:rPr>
+              <w:t>Phần tử nằm theo luồng bình thường của trang.</w:t>
             </w:r>
           </w:p>
         </w:tc>
@@ -7606,15 +7942,55 @@
           <w:p>
             <w:pPr>
               <w:spacing w:line="360" w:lineRule="auto"/>
-            </w:pPr>
-            <w:r>
               <w:rPr>
                 <w:rFonts w:ascii="inter" w:eastAsia="inter" w:hAnsi="inter" w:cs="inter"/>
                 <w:i/>
                 <w:color w:val="000000"/>
                 <w:sz w:val="17"/>
               </w:rPr>
-              <w:t>(Tự điền)</w:t>
+            </w:pPr>
+            <w:r>
+              <w:rPr>
+                <w:rFonts w:ascii="inter" w:eastAsia="inter" w:hAnsi="inter" w:cs="inter"/>
+                <w:i/>
+                <w:color w:val="000000"/>
+                <w:sz w:val="17"/>
+              </w:rPr>
+              <w:t>.box1 {</w:t>
+            </w:r>
+          </w:p>
+          <w:p>
+            <w:pPr>
+              <w:spacing w:line="360" w:lineRule="auto"/>
+              <w:rPr>
+                <w:rFonts w:ascii="inter" w:eastAsia="inter" w:hAnsi="inter" w:cs="inter"/>
+                <w:i/>
+                <w:color w:val="000000"/>
+                <w:sz w:val="17"/>
+              </w:rPr>
+            </w:pPr>
+            <w:r>
+              <w:rPr>
+                <w:rFonts w:ascii="inter" w:eastAsia="inter" w:hAnsi="inter" w:cs="inter"/>
+                <w:i/>
+                <w:color w:val="000000"/>
+                <w:sz w:val="17"/>
+              </w:rPr>
+              <w:t xml:space="preserve">  position: static;</w:t>
+            </w:r>
+          </w:p>
+          <w:p>
+            <w:pPr>
+              <w:spacing w:line="360" w:lineRule="auto"/>
+            </w:pPr>
+            <w:r>
+              <w:rPr>
+                <w:rFonts w:ascii="inter" w:eastAsia="inter" w:hAnsi="inter" w:cs="inter"/>
+                <w:i/>
+                <w:color w:val="000000"/>
+                <w:sz w:val="17"/>
+              </w:rPr>
+              <w:t>}</w:t>
             </w:r>
           </w:p>
         </w:tc>
@@ -7670,7 +8046,31 @@
                 <w:color w:val="000000"/>
                 <w:sz w:val="17"/>
               </w:rPr>
-              <w:t>(Tự điền)</w:t>
+              <w:t>Vẫn nằm trong luồng bình thường.</w:t>
+            </w:r>
+            <w:r>
+              <w:t xml:space="preserve"> </w:t>
+            </w:r>
+            <w:r>
+              <w:rPr>
+                <w:rFonts w:ascii="inter" w:eastAsia="inter" w:hAnsi="inter" w:cs="inter"/>
+                <w:i/>
+                <w:color w:val="000000"/>
+                <w:sz w:val="17"/>
+              </w:rPr>
+              <w:t>Có thể dịch chuyển so với vị trí ban đầu của chính nó.</w:t>
+            </w:r>
+            <w:r>
+              <w:t xml:space="preserve"> </w:t>
+            </w:r>
+            <w:r>
+              <w:rPr>
+                <w:rFonts w:ascii="inter" w:eastAsia="inter" w:hAnsi="inter" w:cs="inter"/>
+                <w:i/>
+                <w:color w:val="000000"/>
+                <w:sz w:val="17"/>
+              </w:rPr>
+              <w:t>Không ảnh hưởng vị trí các phần tử khác.</w:t>
             </w:r>
           </w:p>
         </w:tc>
@@ -7685,15 +8085,95 @@
           <w:p>
             <w:pPr>
               <w:spacing w:line="360" w:lineRule="auto"/>
-            </w:pPr>
-            <w:r>
               <w:rPr>
                 <w:rFonts w:ascii="inter" w:eastAsia="inter" w:hAnsi="inter" w:cs="inter"/>
                 <w:i/>
                 <w:color w:val="000000"/>
                 <w:sz w:val="17"/>
               </w:rPr>
-              <w:t>(Tự điền)</w:t>
+            </w:pPr>
+            <w:r>
+              <w:rPr>
+                <w:rFonts w:ascii="inter" w:eastAsia="inter" w:hAnsi="inter" w:cs="inter"/>
+                <w:i/>
+                <w:color w:val="000000"/>
+                <w:sz w:val="17"/>
+              </w:rPr>
+              <w:t>.box2 {</w:t>
+            </w:r>
+          </w:p>
+          <w:p>
+            <w:pPr>
+              <w:spacing w:line="360" w:lineRule="auto"/>
+              <w:rPr>
+                <w:rFonts w:ascii="inter" w:eastAsia="inter" w:hAnsi="inter" w:cs="inter"/>
+                <w:i/>
+                <w:color w:val="000000"/>
+                <w:sz w:val="17"/>
+              </w:rPr>
+            </w:pPr>
+            <w:r>
+              <w:rPr>
+                <w:rFonts w:ascii="inter" w:eastAsia="inter" w:hAnsi="inter" w:cs="inter"/>
+                <w:i/>
+                <w:color w:val="000000"/>
+                <w:sz w:val="17"/>
+              </w:rPr>
+              <w:t xml:space="preserve">  position: relative;</w:t>
+            </w:r>
+          </w:p>
+          <w:p>
+            <w:pPr>
+              <w:spacing w:line="360" w:lineRule="auto"/>
+              <w:rPr>
+                <w:rFonts w:ascii="inter" w:eastAsia="inter" w:hAnsi="inter" w:cs="inter"/>
+                <w:i/>
+                <w:color w:val="000000"/>
+                <w:sz w:val="17"/>
+              </w:rPr>
+            </w:pPr>
+            <w:r>
+              <w:rPr>
+                <w:rFonts w:ascii="inter" w:eastAsia="inter" w:hAnsi="inter" w:cs="inter"/>
+                <w:i/>
+                <w:color w:val="000000"/>
+                <w:sz w:val="17"/>
+              </w:rPr>
+              <w:t xml:space="preserve">  top: 10px;</w:t>
+            </w:r>
+          </w:p>
+          <w:p>
+            <w:pPr>
+              <w:spacing w:line="360" w:lineRule="auto"/>
+              <w:rPr>
+                <w:rFonts w:ascii="inter" w:eastAsia="inter" w:hAnsi="inter" w:cs="inter"/>
+                <w:i/>
+                <w:color w:val="000000"/>
+                <w:sz w:val="17"/>
+              </w:rPr>
+            </w:pPr>
+            <w:r>
+              <w:rPr>
+                <w:rFonts w:ascii="inter" w:eastAsia="inter" w:hAnsi="inter" w:cs="inter"/>
+                <w:i/>
+                <w:color w:val="000000"/>
+                <w:sz w:val="17"/>
+              </w:rPr>
+              <w:t xml:space="preserve">  left: 20px;</w:t>
+            </w:r>
+          </w:p>
+          <w:p>
+            <w:pPr>
+              <w:spacing w:line="360" w:lineRule="auto"/>
+            </w:pPr>
+            <w:r>
+              <w:rPr>
+                <w:rFonts w:ascii="inter" w:eastAsia="inter" w:hAnsi="inter" w:cs="inter"/>
+                <w:i/>
+                <w:color w:val="000000"/>
+                <w:sz w:val="17"/>
+              </w:rPr>
+              <w:t>}</w:t>
             </w:r>
           </w:p>
         </w:tc>
@@ -7725,6 +8205,7 @@
                 <w:sz w:val="18"/>
                 <w:shd w:val="clear" w:color="auto" w:fill="F8F8FA"/>
               </w:rPr>
+              <w:lastRenderedPageBreak/>
               <w:t>absolute</w:t>
             </w:r>
           </w:p>
@@ -7749,7 +8230,31 @@
                 <w:color w:val="000000"/>
                 <w:sz w:val="17"/>
               </w:rPr>
-              <w:t>(Tự điền)</w:t>
+              <w:t>Thoát khỏi luồng bình thường.</w:t>
+            </w:r>
+            <w:r>
+              <w:t xml:space="preserve"> </w:t>
+            </w:r>
+            <w:r>
+              <w:rPr>
+                <w:rFonts w:ascii="inter" w:eastAsia="inter" w:hAnsi="inter" w:cs="inter"/>
+                <w:i/>
+                <w:color w:val="000000"/>
+                <w:sz w:val="17"/>
+              </w:rPr>
+              <w:t>Định vị theo phần tử cha gần nhất có position khác static.</w:t>
+            </w:r>
+            <w:r>
+              <w:t xml:space="preserve"> </w:t>
+            </w:r>
+            <w:r>
+              <w:rPr>
+                <w:rFonts w:ascii="inter" w:eastAsia="inter" w:hAnsi="inter" w:cs="inter"/>
+                <w:i/>
+                <w:color w:val="000000"/>
+                <w:sz w:val="17"/>
+              </w:rPr>
+              <w:t>Nếu không có cha → bám theo body.</w:t>
             </w:r>
           </w:p>
         </w:tc>
@@ -7764,15 +8269,166 @@
           <w:p>
             <w:pPr>
               <w:spacing w:line="360" w:lineRule="auto"/>
-            </w:pPr>
-            <w:r>
               <w:rPr>
                 <w:rFonts w:ascii="inter" w:eastAsia="inter" w:hAnsi="inter" w:cs="inter"/>
                 <w:i/>
                 <w:color w:val="000000"/>
                 <w:sz w:val="17"/>
               </w:rPr>
-              <w:t>(Tự điền)</w:t>
+            </w:pPr>
+            <w:r>
+              <w:rPr>
+                <w:rFonts w:ascii="inter" w:eastAsia="inter" w:hAnsi="inter" w:cs="inter"/>
+                <w:i/>
+                <w:color w:val="000000"/>
+                <w:sz w:val="17"/>
+              </w:rPr>
+              <w:t>.parent {</w:t>
+            </w:r>
+          </w:p>
+          <w:p>
+            <w:pPr>
+              <w:spacing w:line="360" w:lineRule="auto"/>
+              <w:rPr>
+                <w:rFonts w:ascii="inter" w:eastAsia="inter" w:hAnsi="inter" w:cs="inter"/>
+                <w:i/>
+                <w:color w:val="000000"/>
+                <w:sz w:val="17"/>
+              </w:rPr>
+            </w:pPr>
+            <w:r>
+              <w:rPr>
+                <w:rFonts w:ascii="inter" w:eastAsia="inter" w:hAnsi="inter" w:cs="inter"/>
+                <w:i/>
+                <w:color w:val="000000"/>
+                <w:sz w:val="17"/>
+              </w:rPr>
+              <w:t xml:space="preserve">  position: relative;</w:t>
+            </w:r>
+          </w:p>
+          <w:p>
+            <w:pPr>
+              <w:spacing w:line="360" w:lineRule="auto"/>
+              <w:rPr>
+                <w:rFonts w:ascii="inter" w:eastAsia="inter" w:hAnsi="inter" w:cs="inter"/>
+                <w:i/>
+                <w:color w:val="000000"/>
+                <w:sz w:val="17"/>
+              </w:rPr>
+            </w:pPr>
+            <w:r>
+              <w:rPr>
+                <w:rFonts w:ascii="inter" w:eastAsia="inter" w:hAnsi="inter" w:cs="inter"/>
+                <w:i/>
+                <w:color w:val="000000"/>
+                <w:sz w:val="17"/>
+              </w:rPr>
+              <w:t>}</w:t>
+            </w:r>
+          </w:p>
+          <w:p>
+            <w:pPr>
+              <w:spacing w:line="360" w:lineRule="auto"/>
+              <w:rPr>
+                <w:rFonts w:ascii="inter" w:eastAsia="inter" w:hAnsi="inter" w:cs="inter"/>
+                <w:i/>
+                <w:color w:val="000000"/>
+                <w:sz w:val="17"/>
+              </w:rPr>
+            </w:pPr>
+          </w:p>
+          <w:p>
+            <w:pPr>
+              <w:spacing w:line="360" w:lineRule="auto"/>
+              <w:rPr>
+                <w:rFonts w:ascii="inter" w:eastAsia="inter" w:hAnsi="inter" w:cs="inter"/>
+                <w:i/>
+                <w:color w:val="000000"/>
+                <w:sz w:val="17"/>
+              </w:rPr>
+            </w:pPr>
+            <w:r>
+              <w:rPr>
+                <w:rFonts w:ascii="inter" w:eastAsia="inter" w:hAnsi="inter" w:cs="inter"/>
+                <w:i/>
+                <w:color w:val="000000"/>
+                <w:sz w:val="17"/>
+              </w:rPr>
+              <w:t>.child {</w:t>
+            </w:r>
+          </w:p>
+          <w:p>
+            <w:pPr>
+              <w:spacing w:line="360" w:lineRule="auto"/>
+              <w:rPr>
+                <w:rFonts w:ascii="inter" w:eastAsia="inter" w:hAnsi="inter" w:cs="inter"/>
+                <w:i/>
+                <w:color w:val="000000"/>
+                <w:sz w:val="17"/>
+              </w:rPr>
+            </w:pPr>
+            <w:r>
+              <w:rPr>
+                <w:rFonts w:ascii="inter" w:eastAsia="inter" w:hAnsi="inter" w:cs="inter"/>
+                <w:i/>
+                <w:color w:val="000000"/>
+                <w:sz w:val="17"/>
+              </w:rPr>
+              <w:t xml:space="preserve">  position: absolute;</w:t>
+            </w:r>
+          </w:p>
+          <w:p>
+            <w:pPr>
+              <w:spacing w:line="360" w:lineRule="auto"/>
+              <w:rPr>
+                <w:rFonts w:ascii="inter" w:eastAsia="inter" w:hAnsi="inter" w:cs="inter"/>
+                <w:i/>
+                <w:color w:val="000000"/>
+                <w:sz w:val="17"/>
+              </w:rPr>
+            </w:pPr>
+            <w:r>
+              <w:rPr>
+                <w:rFonts w:ascii="inter" w:eastAsia="inter" w:hAnsi="inter" w:cs="inter"/>
+                <w:i/>
+                <w:color w:val="000000"/>
+                <w:sz w:val="17"/>
+              </w:rPr>
+              <w:t xml:space="preserve">  top: 0;</w:t>
+            </w:r>
+          </w:p>
+          <w:p>
+            <w:pPr>
+              <w:spacing w:line="360" w:lineRule="auto"/>
+              <w:rPr>
+                <w:rFonts w:ascii="inter" w:eastAsia="inter" w:hAnsi="inter" w:cs="inter"/>
+                <w:i/>
+                <w:color w:val="000000"/>
+                <w:sz w:val="17"/>
+              </w:rPr>
+            </w:pPr>
+            <w:r>
+              <w:rPr>
+                <w:rFonts w:ascii="inter" w:eastAsia="inter" w:hAnsi="inter" w:cs="inter"/>
+                <w:i/>
+                <w:color w:val="000000"/>
+                <w:sz w:val="17"/>
+              </w:rPr>
+              <w:t xml:space="preserve">  right: 0;</w:t>
+            </w:r>
+          </w:p>
+          <w:p>
+            <w:pPr>
+              <w:spacing w:line="360" w:lineRule="auto"/>
+            </w:pPr>
+            <w:r>
+              <w:rPr>
+                <w:rFonts w:ascii="inter" w:eastAsia="inter" w:hAnsi="inter" w:cs="inter"/>
+                <w:i/>
+                <w:color w:val="000000"/>
+                <w:sz w:val="17"/>
+              </w:rPr>
+              <w:t>}</w:t>
             </w:r>
           </w:p>
         </w:tc>
@@ -7828,7 +8484,19 @@
                 <w:color w:val="000000"/>
                 <w:sz w:val="17"/>
               </w:rPr>
-              <w:t>(Tự điền)</w:t>
+              <w:t>Cố định theo viewport (màn hình).</w:t>
+            </w:r>
+            <w:r>
+              <w:t xml:space="preserve"> </w:t>
+            </w:r>
+            <w:r>
+              <w:rPr>
+                <w:rFonts w:ascii="inter" w:eastAsia="inter" w:hAnsi="inter" w:cs="inter"/>
+                <w:i/>
+                <w:color w:val="000000"/>
+                <w:sz w:val="17"/>
+              </w:rPr>
+              <w:t>Không bị ảnh hưởng khi scroll.</w:t>
             </w:r>
           </w:p>
         </w:tc>
@@ -7843,15 +8511,95 @@
           <w:p>
             <w:pPr>
               <w:spacing w:line="360" w:lineRule="auto"/>
-            </w:pPr>
-            <w:r>
               <w:rPr>
                 <w:rFonts w:ascii="inter" w:eastAsia="inter" w:hAnsi="inter" w:cs="inter"/>
                 <w:i/>
                 <w:color w:val="000000"/>
                 <w:sz w:val="17"/>
               </w:rPr>
-              <w:t>(Tự điền)</w:t>
+            </w:pPr>
+            <w:r>
+              <w:rPr>
+                <w:rFonts w:ascii="inter" w:eastAsia="inter" w:hAnsi="inter" w:cs="inter"/>
+                <w:i/>
+                <w:color w:val="000000"/>
+                <w:sz w:val="17"/>
+              </w:rPr>
+              <w:t>.fixed-btn {</w:t>
+            </w:r>
+          </w:p>
+          <w:p>
+            <w:pPr>
+              <w:spacing w:line="360" w:lineRule="auto"/>
+              <w:rPr>
+                <w:rFonts w:ascii="inter" w:eastAsia="inter" w:hAnsi="inter" w:cs="inter"/>
+                <w:i/>
+                <w:color w:val="000000"/>
+                <w:sz w:val="17"/>
+              </w:rPr>
+            </w:pPr>
+            <w:r>
+              <w:rPr>
+                <w:rFonts w:ascii="inter" w:eastAsia="inter" w:hAnsi="inter" w:cs="inter"/>
+                <w:i/>
+                <w:color w:val="000000"/>
+                <w:sz w:val="17"/>
+              </w:rPr>
+              <w:t xml:space="preserve">  position: fixed;</w:t>
+            </w:r>
+          </w:p>
+          <w:p>
+            <w:pPr>
+              <w:spacing w:line="360" w:lineRule="auto"/>
+              <w:rPr>
+                <w:rFonts w:ascii="inter" w:eastAsia="inter" w:hAnsi="inter" w:cs="inter"/>
+                <w:i/>
+                <w:color w:val="000000"/>
+                <w:sz w:val="17"/>
+              </w:rPr>
+            </w:pPr>
+            <w:r>
+              <w:rPr>
+                <w:rFonts w:ascii="inter" w:eastAsia="inter" w:hAnsi="inter" w:cs="inter"/>
+                <w:i/>
+                <w:color w:val="000000"/>
+                <w:sz w:val="17"/>
+              </w:rPr>
+              <w:t xml:space="preserve">  bottom: 20px;</w:t>
+            </w:r>
+          </w:p>
+          <w:p>
+            <w:pPr>
+              <w:spacing w:line="360" w:lineRule="auto"/>
+              <w:rPr>
+                <w:rFonts w:ascii="inter" w:eastAsia="inter" w:hAnsi="inter" w:cs="inter"/>
+                <w:i/>
+                <w:color w:val="000000"/>
+                <w:sz w:val="17"/>
+              </w:rPr>
+            </w:pPr>
+            <w:r>
+              <w:rPr>
+                <w:rFonts w:ascii="inter" w:eastAsia="inter" w:hAnsi="inter" w:cs="inter"/>
+                <w:i/>
+                <w:color w:val="000000"/>
+                <w:sz w:val="17"/>
+              </w:rPr>
+              <w:t xml:space="preserve">  right: 20px;</w:t>
+            </w:r>
+          </w:p>
+          <w:p>
+            <w:pPr>
+              <w:spacing w:line="360" w:lineRule="auto"/>
+            </w:pPr>
+            <w:r>
+              <w:rPr>
+                <w:rFonts w:ascii="inter" w:eastAsia="inter" w:hAnsi="inter" w:cs="inter"/>
+                <w:i/>
+                <w:color w:val="000000"/>
+                <w:sz w:val="17"/>
+              </w:rPr>
+              <w:t>}</w:t>
             </w:r>
           </w:p>
         </w:tc>
@@ -7907,7 +8655,31 @@
                 <w:color w:val="000000"/>
                 <w:sz w:val="17"/>
               </w:rPr>
-              <w:t>(Tự điền)</w:t>
+              <w:t>Ban đầu như relative.</w:t>
+            </w:r>
+            <w:r>
+              <w:t xml:space="preserve"> </w:t>
+            </w:r>
+            <w:r>
+              <w:rPr>
+                <w:rFonts w:ascii="inter" w:eastAsia="inter" w:hAnsi="inter" w:cs="inter"/>
+                <w:i/>
+                <w:color w:val="000000"/>
+                <w:sz w:val="17"/>
+              </w:rPr>
+              <w:t>Khi scroll đến vị trí nhất định → dính lại.</w:t>
+            </w:r>
+            <w:r>
+              <w:t xml:space="preserve"> </w:t>
+            </w:r>
+            <w:r>
+              <w:rPr>
+                <w:rFonts w:ascii="inter" w:eastAsia="inter" w:hAnsi="inter" w:cs="inter"/>
+                <w:i/>
+                <w:color w:val="000000"/>
+                <w:sz w:val="17"/>
+              </w:rPr>
+              <w:t>Cần top, left hoặc right để hoạt động.</w:t>
             </w:r>
           </w:p>
         </w:tc>
@@ -7922,15 +8694,75 @@
           <w:p>
             <w:pPr>
               <w:spacing w:line="360" w:lineRule="auto"/>
-            </w:pPr>
-            <w:r>
               <w:rPr>
                 <w:rFonts w:ascii="inter" w:eastAsia="inter" w:hAnsi="inter" w:cs="inter"/>
                 <w:i/>
                 <w:color w:val="000000"/>
                 <w:sz w:val="17"/>
               </w:rPr>
-              <w:t>(Tự điền)</w:t>
+            </w:pPr>
+            <w:r>
+              <w:rPr>
+                <w:rFonts w:ascii="inter" w:eastAsia="inter" w:hAnsi="inter" w:cs="inter"/>
+                <w:i/>
+                <w:color w:val="000000"/>
+                <w:sz w:val="17"/>
+              </w:rPr>
+              <w:t>.header {</w:t>
+            </w:r>
+          </w:p>
+          <w:p>
+            <w:pPr>
+              <w:spacing w:line="360" w:lineRule="auto"/>
+              <w:rPr>
+                <w:rFonts w:ascii="inter" w:eastAsia="inter" w:hAnsi="inter" w:cs="inter"/>
+                <w:i/>
+                <w:color w:val="000000"/>
+                <w:sz w:val="17"/>
+              </w:rPr>
+            </w:pPr>
+            <w:r>
+              <w:rPr>
+                <w:rFonts w:ascii="inter" w:eastAsia="inter" w:hAnsi="inter" w:cs="inter"/>
+                <w:i/>
+                <w:color w:val="000000"/>
+                <w:sz w:val="17"/>
+              </w:rPr>
+              <w:t xml:space="preserve">  position: sticky;</w:t>
+            </w:r>
+          </w:p>
+          <w:p>
+            <w:pPr>
+              <w:spacing w:line="360" w:lineRule="auto"/>
+              <w:rPr>
+                <w:rFonts w:ascii="inter" w:eastAsia="inter" w:hAnsi="inter" w:cs="inter"/>
+                <w:i/>
+                <w:color w:val="000000"/>
+                <w:sz w:val="17"/>
+              </w:rPr>
+            </w:pPr>
+            <w:r>
+              <w:rPr>
+                <w:rFonts w:ascii="inter" w:eastAsia="inter" w:hAnsi="inter" w:cs="inter"/>
+                <w:i/>
+                <w:color w:val="000000"/>
+                <w:sz w:val="17"/>
+              </w:rPr>
+              <w:t xml:space="preserve">  top: 0;</w:t>
+            </w:r>
+          </w:p>
+          <w:p>
+            <w:pPr>
+              <w:spacing w:line="360" w:lineRule="auto"/>
+            </w:pPr>
+            <w:r>
+              <w:rPr>
+                <w:rFonts w:ascii="inter" w:eastAsia="inter" w:hAnsi="inter" w:cs="inter"/>
+                <w:i/>
+                <w:color w:val="000000"/>
+                <w:sz w:val="17"/>
+              </w:rPr>
+              <w:t>}</w:t>
             </w:r>
           </w:p>
         </w:tc>
@@ -8042,15 +8874,6 @@
           <w:sz w:val="18"/>
         </w:rPr>
         <w:br/>
-      </w:r>
-      <w:r>
-        <w:rPr>
-          <w:rStyle w:val="VerbatimChar"/>
-          <w:rFonts w:ascii="IBM Plex Mono" w:eastAsia="IBM Plex Mono" w:hAnsi="IBM Plex Mono" w:cs="IBM Plex Mono"/>
-          <w:color w:val="000000"/>
-          <w:sz w:val="18"/>
-        </w:rPr>
-        <w:lastRenderedPageBreak/>
         <w:t>@media (min-width: 768px) {</w:t>
       </w:r>
       <w:r>
@@ -8138,6 +8961,7 @@
           <w:b/>
           <w:color w:val="000000"/>
         </w:rPr>
+        <w:lastRenderedPageBreak/>
         <w:t>Tablet</w:t>
       </w:r>
       <w:r>
@@ -8467,6 +9291,85 @@
           <w:sz w:val="18"/>
         </w:rPr>
         <w:br/>
+        <w:t xml:space="preserve">    /* TODO: Thêm box-shadow để tạo hiệu ứng nổi */</w:t>
+      </w:r>
+      <w:r>
+        <w:rPr>
+          <w:rStyle w:val="VerbatimChar"/>
+          <w:rFonts w:ascii="IBM Plex Mono" w:eastAsia="IBM Plex Mono" w:hAnsi="IBM Plex Mono" w:cs="IBM Plex Mono"/>
+          <w:color w:val="000000"/>
+          <w:sz w:val="18"/>
+        </w:rPr>
+        <w:br/>
+        <w:t>}</w:t>
+      </w:r>
+      <w:r>
+        <w:rPr>
+          <w:rStyle w:val="VerbatimChar"/>
+          <w:rFonts w:ascii="IBM Plex Mono" w:eastAsia="IBM Plex Mono" w:hAnsi="IBM Plex Mono" w:cs="IBM Plex Mono"/>
+          <w:color w:val="000000"/>
+          <w:sz w:val="18"/>
+        </w:rPr>
+        <w:br/>
+      </w:r>
+      <w:r>
+        <w:rPr>
+          <w:rStyle w:val="VerbatimChar"/>
+          <w:rFonts w:ascii="IBM Plex Mono" w:eastAsia="IBM Plex Mono" w:hAnsi="IBM Plex Mono" w:cs="IBM Plex Mono"/>
+          <w:color w:val="000000"/>
+          <w:sz w:val="18"/>
+        </w:rPr>
+        <w:br/>
+        <w:t>/* Nút Scroll to Top */</w:t>
+      </w:r>
+      <w:r>
+        <w:rPr>
+          <w:rStyle w:val="VerbatimChar"/>
+          <w:rFonts w:ascii="IBM Plex Mono" w:eastAsia="IBM Plex Mono" w:hAnsi="IBM Plex Mono" w:cs="IBM Plex Mono"/>
+          <w:color w:val="000000"/>
+          <w:sz w:val="18"/>
+        </w:rPr>
+        <w:br/>
+        <w:t>.scroll-top {</w:t>
+      </w:r>
+      <w:r>
+        <w:rPr>
+          <w:rStyle w:val="VerbatimChar"/>
+          <w:rFonts w:ascii="IBM Plex Mono" w:eastAsia="IBM Plex Mono" w:hAnsi="IBM Plex Mono" w:cs="IBM Plex Mono"/>
+          <w:color w:val="000000"/>
+          <w:sz w:val="18"/>
+        </w:rPr>
+        <w:br/>
+        <w:t xml:space="preserve">    position: fixed;</w:t>
+      </w:r>
+      <w:r>
+        <w:rPr>
+          <w:rStyle w:val="VerbatimChar"/>
+          <w:rFonts w:ascii="IBM Plex Mono" w:eastAsia="IBM Plex Mono" w:hAnsi="IBM Plex Mono" w:cs="IBM Plex Mono"/>
+          <w:color w:val="000000"/>
+          <w:sz w:val="18"/>
+        </w:rPr>
+        <w:br/>
+        <w:t xml:space="preserve">    bottom: 30px;</w:t>
+      </w:r>
+      <w:r>
+        <w:rPr>
+          <w:rStyle w:val="VerbatimChar"/>
+          <w:rFonts w:ascii="IBM Plex Mono" w:eastAsia="IBM Plex Mono" w:hAnsi="IBM Plex Mono" w:cs="IBM Plex Mono"/>
+          <w:color w:val="000000"/>
+          <w:sz w:val="18"/>
+        </w:rPr>
+        <w:br/>
+        <w:t xml:space="preserve">    right: 30px;</w:t>
+      </w:r>
+      <w:r>
+        <w:rPr>
+          <w:rStyle w:val="VerbatimChar"/>
+          <w:rFonts w:ascii="IBM Plex Mono" w:eastAsia="IBM Plex Mono" w:hAnsi="IBM Plex Mono" w:cs="IBM Plex Mono"/>
+          <w:color w:val="000000"/>
+          <w:sz w:val="18"/>
+        </w:rPr>
+        <w:br/>
       </w:r>
       <w:r>
         <w:rPr>
@@ -8476,85 +9379,6 @@
           <w:sz w:val="18"/>
         </w:rPr>
         <w:lastRenderedPageBreak/>
-        <w:t xml:space="preserve">    /* TODO: Thêm box-shadow để tạo hiệu ứng nổi */</w:t>
-      </w:r>
-      <w:r>
-        <w:rPr>
-          <w:rStyle w:val="VerbatimChar"/>
-          <w:rFonts w:ascii="IBM Plex Mono" w:eastAsia="IBM Plex Mono" w:hAnsi="IBM Plex Mono" w:cs="IBM Plex Mono"/>
-          <w:color w:val="000000"/>
-          <w:sz w:val="18"/>
-        </w:rPr>
-        <w:br/>
-        <w:t>}</w:t>
-      </w:r>
-      <w:r>
-        <w:rPr>
-          <w:rStyle w:val="VerbatimChar"/>
-          <w:rFonts w:ascii="IBM Plex Mono" w:eastAsia="IBM Plex Mono" w:hAnsi="IBM Plex Mono" w:cs="IBM Plex Mono"/>
-          <w:color w:val="000000"/>
-          <w:sz w:val="18"/>
-        </w:rPr>
-        <w:br/>
-      </w:r>
-      <w:r>
-        <w:rPr>
-          <w:rStyle w:val="VerbatimChar"/>
-          <w:rFonts w:ascii="IBM Plex Mono" w:eastAsia="IBM Plex Mono" w:hAnsi="IBM Plex Mono" w:cs="IBM Plex Mono"/>
-          <w:color w:val="000000"/>
-          <w:sz w:val="18"/>
-        </w:rPr>
-        <w:br/>
-        <w:t>/* Nút Scroll to Top */</w:t>
-      </w:r>
-      <w:r>
-        <w:rPr>
-          <w:rStyle w:val="VerbatimChar"/>
-          <w:rFonts w:ascii="IBM Plex Mono" w:eastAsia="IBM Plex Mono" w:hAnsi="IBM Plex Mono" w:cs="IBM Plex Mono"/>
-          <w:color w:val="000000"/>
-          <w:sz w:val="18"/>
-        </w:rPr>
-        <w:br/>
-        <w:t>.scroll-top {</w:t>
-      </w:r>
-      <w:r>
-        <w:rPr>
-          <w:rStyle w:val="VerbatimChar"/>
-          <w:rFonts w:ascii="IBM Plex Mono" w:eastAsia="IBM Plex Mono" w:hAnsi="IBM Plex Mono" w:cs="IBM Plex Mono"/>
-          <w:color w:val="000000"/>
-          <w:sz w:val="18"/>
-        </w:rPr>
-        <w:br/>
-        <w:t xml:space="preserve">    position: fixed;</w:t>
-      </w:r>
-      <w:r>
-        <w:rPr>
-          <w:rStyle w:val="VerbatimChar"/>
-          <w:rFonts w:ascii="IBM Plex Mono" w:eastAsia="IBM Plex Mono" w:hAnsi="IBM Plex Mono" w:cs="IBM Plex Mono"/>
-          <w:color w:val="000000"/>
-          <w:sz w:val="18"/>
-        </w:rPr>
-        <w:br/>
-        <w:t xml:space="preserve">    bottom: 30px;</w:t>
-      </w:r>
-      <w:r>
-        <w:rPr>
-          <w:rStyle w:val="VerbatimChar"/>
-          <w:rFonts w:ascii="IBM Plex Mono" w:eastAsia="IBM Plex Mono" w:hAnsi="IBM Plex Mono" w:cs="IBM Plex Mono"/>
-          <w:color w:val="000000"/>
-          <w:sz w:val="18"/>
-        </w:rPr>
-        <w:br/>
-        <w:t xml:space="preserve">    right: 30px;</w:t>
-      </w:r>
-      <w:r>
-        <w:rPr>
-          <w:rStyle w:val="VerbatimChar"/>
-          <w:rFonts w:ascii="IBM Plex Mono" w:eastAsia="IBM Plex Mono" w:hAnsi="IBM Plex Mono" w:cs="IBM Plex Mono"/>
-          <w:color w:val="000000"/>
-          <w:sz w:val="18"/>
-        </w:rPr>
-        <w:br/>
         <w:t xml:space="preserve">    /* TODO:</w:t>
       </w:r>
       <w:r>
@@ -8846,18 +9670,66 @@
     <w:p>
       <w:pPr>
         <w:spacing w:after="210" w:line="360" w:lineRule="auto"/>
-      </w:pPr>
-      <w:r>
         <w:rPr>
           <w:rFonts w:ascii="inter" w:eastAsia="inter" w:hAnsi="inter" w:cs="inter"/>
           <w:i/>
           <w:color w:val="000000"/>
         </w:rPr>
+      </w:pPr>
+      <w:r>
+        <w:rPr>
+          <w:rFonts w:ascii="inter" w:eastAsia="inter" w:hAnsi="inter" w:cs="inter"/>
+          <w:i/>
+          <w:color w:val="000000"/>
+        </w:rPr>
         <w:t>(Dán ảnh: Giao diện có header sticky và nút scroll)</w:t>
       </w:r>
     </w:p>
     <w:p>
       <w:pPr>
+        <w:spacing w:after="210" w:line="360" w:lineRule="auto"/>
+      </w:pPr>
+      <w:r>
+        <w:lastRenderedPageBreak/>
+        <w:drawing>
+          <wp:inline distT="0" distB="0" distL="0" distR="0" wp14:anchorId="79C9CE4A" wp14:editId="6FE8FA93">
+            <wp:extent cx="6038850" cy="3395345"/>
+            <wp:effectExtent l="0" t="0" r="0" b="0"/>
+            <wp:docPr id="556224467" name="Hình ảnh 1" descr="Ảnh có chứa văn bản, phần mềm, ảnh chụp màn hình, Phần mềm đa phương tiện&#10;&#10;Nội dung do AI tạo ra có thể không chính xác."/>
+            <wp:cNvGraphicFramePr>
+              <a:graphicFrameLocks xmlns:a="http://schemas.openxmlformats.org/drawingml/2006/main" noChangeAspect="1"/>
+            </wp:cNvGraphicFramePr>
+            <a:graphic xmlns:a="http://schemas.openxmlformats.org/drawingml/2006/main">
+              <a:graphicData uri="http://schemas.openxmlformats.org/drawingml/2006/picture">
+                <pic:pic xmlns:pic="http://schemas.openxmlformats.org/drawingml/2006/picture">
+                  <pic:nvPicPr>
+                    <pic:cNvPr id="556224467" name="Hình ảnh 1" descr="Ảnh có chứa văn bản, phần mềm, ảnh chụp màn hình, Phần mềm đa phương tiện&#10;&#10;Nội dung do AI tạo ra có thể không chính xác."/>
+                    <pic:cNvPicPr/>
+                  </pic:nvPicPr>
+                  <pic:blipFill>
+                    <a:blip r:embed="rId15"/>
+                    <a:stretch>
+                      <a:fillRect/>
+                    </a:stretch>
+                  </pic:blipFill>
+                  <pic:spPr>
+                    <a:xfrm>
+                      <a:off x="0" y="0"/>
+                      <a:ext cx="6038850" cy="3395345"/>
+                    </a:xfrm>
+                    <a:prstGeom prst="rect">
+                      <a:avLst/>
+                    </a:prstGeom>
+                  </pic:spPr>
+                </pic:pic>
+              </a:graphicData>
+            </a:graphic>
+          </wp:inline>
+        </w:drawing>
+      </w:r>
+    </w:p>
+    <w:p>
+      <w:pPr>
         <w:rPr>
           <w:noProof/>
         </w:rPr>
@@ -8866,8 +9738,41 @@
         <w:rPr>
           <w:noProof/>
         </w:rPr>
-        <w:lastRenderedPageBreak/>
-        <w:br w:type="page"/>
+        <w:drawing>
+          <wp:inline distT="0" distB="0" distL="0" distR="0" wp14:anchorId="33A7D0B4" wp14:editId="544D0838">
+            <wp:extent cx="6038850" cy="3395345"/>
+            <wp:effectExtent l="0" t="0" r="0" b="0"/>
+            <wp:docPr id="667351933" name="Hình ảnh 1"/>
+            <wp:cNvGraphicFramePr>
+              <a:graphicFrameLocks xmlns:a="http://schemas.openxmlformats.org/drawingml/2006/main" noChangeAspect="1"/>
+            </wp:cNvGraphicFramePr>
+            <a:graphic xmlns:a="http://schemas.openxmlformats.org/drawingml/2006/main">
+              <a:graphicData uri="http://schemas.openxmlformats.org/drawingml/2006/picture">
+                <pic:pic xmlns:pic="http://schemas.openxmlformats.org/drawingml/2006/picture">
+                  <pic:nvPicPr>
+                    <pic:cNvPr id="667351933" name=""/>
+                    <pic:cNvPicPr/>
+                  </pic:nvPicPr>
+                  <pic:blipFill>
+                    <a:blip r:embed="rId16"/>
+                    <a:stretch>
+                      <a:fillRect/>
+                    </a:stretch>
+                  </pic:blipFill>
+                  <pic:spPr>
+                    <a:xfrm>
+                      <a:off x="0" y="0"/>
+                      <a:ext cx="6038850" cy="3395345"/>
+                    </a:xfrm>
+                    <a:prstGeom prst="rect">
+                      <a:avLst/>
+                    </a:prstGeom>
+                  </pic:spPr>
+                </pic:pic>
+              </a:graphicData>
+            </a:graphic>
+          </wp:inline>
+        </w:drawing>
       </w:r>
     </w:p>
     <w:p>
@@ -8883,7 +9788,6 @@
           <w:color w:val="000000"/>
           <w:sz w:val="24"/>
         </w:rPr>
-        <w:lastRenderedPageBreak/>
         <w:t>MINI TEST - Tự Kiểm Tra</w:t>
       </w:r>
       <w:bookmarkEnd w:id="45"/>
@@ -8935,23 +9839,44 @@
           <w:numId w:val="16"/>
         </w:numPr>
         <w:spacing w:before="105" w:after="105" w:line="360" w:lineRule="auto"/>
-      </w:pPr>
-      <w:r>
-        <w:rPr>
-          <w:rFonts w:ascii="inter" w:eastAsia="inter" w:hAnsi="inter" w:cs="inter"/>
-          <w:color w:val="000000"/>
-        </w:rPr>
+        <w:rPr>
+          <w:b/>
+          <w:bCs/>
+        </w:rPr>
+      </w:pPr>
+      <w:r>
+        <w:rPr>
+          <w:rFonts w:ascii="inter" w:eastAsia="inter" w:hAnsi="inter" w:cs="inter"/>
+          <w:b/>
+          <w:bCs/>
+          <w:color w:val="000000"/>
+        </w:rPr>
+        <w:lastRenderedPageBreak/>
         <w:t xml:space="preserve">A. </w:t>
       </w:r>
       <w:r>
         <w:rPr>
           <w:rStyle w:val="VerbatimChar"/>
           <w:rFonts w:ascii="IBM Plex Mono" w:eastAsia="IBM Plex Mono" w:hAnsi="IBM Plex Mono" w:cs="IBM Plex Mono"/>
+          <w:b/>
+          <w:bCs/>
           <w:color w:val="000000"/>
           <w:sz w:val="18"/>
           <w:shd w:val="clear" w:color="auto" w:fill="F8F8FA"/>
         </w:rPr>
         <w:t>div p</w:t>
+      </w:r>
+      <w:r>
+        <w:rPr>
+          <w:rStyle w:val="VerbatimChar"/>
+          <w:rFonts w:ascii="IBM Plex Mono" w:eastAsia="IBM Plex Mono" w:hAnsi="IBM Plex Mono" w:cs="IBM Plex Mono"/>
+          <w:b/>
+          <w:bCs/>
+          <w:color w:val="000000"/>
+          <w:sz w:val="18"/>
+          <w:shd w:val="clear" w:color="auto" w:fill="F8F8FA"/>
+        </w:rPr>
+        <w:t xml:space="preserve">   </w:t>
       </w:r>
     </w:p>
     <w:p>
@@ -9052,10 +9977,16 @@
           <w:numId w:val="17"/>
         </w:numPr>
         <w:spacing w:before="105" w:after="105" w:line="360" w:lineRule="auto"/>
-      </w:pPr>
-      <w:r>
-        <w:rPr>
-          <w:rFonts w:ascii="inter" w:eastAsia="inter" w:hAnsi="inter" w:cs="inter"/>
+        <w:rPr>
+          <w:b/>
+          <w:bCs/>
+        </w:rPr>
+      </w:pPr>
+      <w:r>
+        <w:rPr>
+          <w:rFonts w:ascii="inter" w:eastAsia="inter" w:hAnsi="inter" w:cs="inter"/>
+          <w:b/>
+          <w:bCs/>
           <w:color w:val="000000"/>
         </w:rPr>
         <w:t>B. Chọn phần tử khi rê chuột</w:t>
@@ -9124,10 +10055,16 @@
           <w:numId w:val="18"/>
         </w:numPr>
         <w:spacing w:before="105" w:after="105" w:line="360" w:lineRule="auto"/>
-      </w:pPr>
-      <w:r>
-        <w:rPr>
-          <w:rFonts w:ascii="inter" w:eastAsia="inter" w:hAnsi="inter" w:cs="inter"/>
+        <w:rPr>
+          <w:b/>
+          <w:bCs/>
+        </w:rPr>
+      </w:pPr>
+      <w:r>
+        <w:rPr>
+          <w:rFonts w:ascii="inter" w:eastAsia="inter" w:hAnsi="inter" w:cs="inter"/>
+          <w:b/>
+          <w:bCs/>
           <w:color w:val="000000"/>
         </w:rPr>
         <w:t>A. Width bao gồm content + padding + border</w:t>
@@ -9185,10 +10122,16 @@
           <w:numId w:val="19"/>
         </w:numPr>
         <w:spacing w:before="105" w:after="105" w:line="360" w:lineRule="auto"/>
-      </w:pPr>
-      <w:r>
-        <w:rPr>
-          <w:rFonts w:ascii="inter" w:eastAsia="inter" w:hAnsi="inter" w:cs="inter"/>
+        <w:rPr>
+          <w:b/>
+          <w:bCs/>
+        </w:rPr>
+      </w:pPr>
+      <w:r>
+        <w:rPr>
+          <w:rFonts w:ascii="inter" w:eastAsia="inter" w:hAnsi="inter" w:cs="inter"/>
+          <w:b/>
+          <w:bCs/>
           <w:color w:val="000000"/>
         </w:rPr>
         <w:t>A. Content → Padding → Border → Margin</w:t>
@@ -9263,10 +10206,16 @@
           <w:numId w:val="20"/>
         </w:numPr>
         <w:spacing w:before="105" w:after="105" w:line="360" w:lineRule="auto"/>
-      </w:pPr>
-      <w:r>
-        <w:rPr>
-          <w:rFonts w:ascii="inter" w:eastAsia="inter" w:hAnsi="inter" w:cs="inter"/>
+        <w:rPr>
+          <w:b/>
+          <w:bCs/>
+        </w:rPr>
+      </w:pPr>
+      <w:r>
+        <w:rPr>
+          <w:rFonts w:ascii="inter" w:eastAsia="inter" w:hAnsi="inter" w:cs="inter"/>
+          <w:b/>
+          <w:bCs/>
           <w:color w:val="000000"/>
         </w:rPr>
         <w:t>A. 1 chiều (hàng hoặc cột)</w:t>
@@ -9314,7 +10263,6 @@
           <w:b/>
           <w:color w:val="000000"/>
         </w:rPr>
-        <w:lastRenderedPageBreak/>
         <w:t xml:space="preserve">6. </w:t>
       </w:r>
       <w:r>
@@ -9351,10 +10299,16 @@
           <w:numId w:val="21"/>
         </w:numPr>
         <w:spacing w:before="105" w:after="105" w:line="360" w:lineRule="auto"/>
-      </w:pPr>
-      <w:r>
-        <w:rPr>
-          <w:rFonts w:ascii="inter" w:eastAsia="inter" w:hAnsi="inter" w:cs="inter"/>
+        <w:rPr>
+          <w:b/>
+          <w:bCs/>
+        </w:rPr>
+      </w:pPr>
+      <w:r>
+        <w:rPr>
+          <w:rFonts w:ascii="inter" w:eastAsia="inter" w:hAnsi="inter" w:cs="inter"/>
+          <w:b/>
+          <w:bCs/>
           <w:color w:val="000000"/>
         </w:rPr>
         <w:t>B. Chia đều khoảng trống giữa các item</w:t>
@@ -9386,6 +10340,7 @@
           <w:b/>
           <w:color w:val="000000"/>
         </w:rPr>
+        <w:lastRenderedPageBreak/>
         <w:t>7. Grid tốt hơn Flexbox khi nào?</w:t>
       </w:r>
     </w:p>
@@ -9412,10 +10367,16 @@
           <w:numId w:val="22"/>
         </w:numPr>
         <w:spacing w:before="105" w:after="105" w:line="360" w:lineRule="auto"/>
-      </w:pPr>
-      <w:r>
-        <w:rPr>
-          <w:rFonts w:ascii="inter" w:eastAsia="inter" w:hAnsi="inter" w:cs="inter"/>
+        <w:rPr>
+          <w:b/>
+          <w:bCs/>
+        </w:rPr>
+      </w:pPr>
+      <w:r>
+        <w:rPr>
+          <w:rFonts w:ascii="inter" w:eastAsia="inter" w:hAnsi="inter" w:cs="inter"/>
+          <w:b/>
+          <w:bCs/>
           <w:color w:val="000000"/>
         </w:rPr>
         <w:t>B. Layout phức tạp nhiều hàng cột</w:t>
@@ -9484,10 +10445,16 @@
           <w:numId w:val="23"/>
         </w:numPr>
         <w:spacing w:before="105" w:after="105" w:line="360" w:lineRule="auto"/>
-      </w:pPr>
-      <w:r>
-        <w:rPr>
-          <w:rFonts w:ascii="inter" w:eastAsia="inter" w:hAnsi="inter" w:cs="inter"/>
+        <w:rPr>
+          <w:b/>
+          <w:bCs/>
+        </w:rPr>
+      </w:pPr>
+      <w:r>
+        <w:rPr>
+          <w:rFonts w:ascii="inter" w:eastAsia="inter" w:hAnsi="inter" w:cs="inter"/>
+          <w:b/>
+          <w:bCs/>
           <w:color w:val="000000"/>
         </w:rPr>
         <w:t>A. Cố định so với viewport</w:t>
@@ -9571,10 +10538,16 @@
           <w:numId w:val="24"/>
         </w:numPr>
         <w:spacing w:before="105" w:after="105" w:line="360" w:lineRule="auto"/>
-      </w:pPr>
-      <w:r>
-        <w:rPr>
-          <w:rFonts w:ascii="inter" w:eastAsia="inter" w:hAnsi="inter" w:cs="inter"/>
+        <w:rPr>
+          <w:b/>
+          <w:bCs/>
+        </w:rPr>
+      </w:pPr>
+      <w:r>
+        <w:rPr>
+          <w:rFonts w:ascii="inter" w:eastAsia="inter" w:hAnsi="inter" w:cs="inter"/>
+          <w:b/>
+          <w:bCs/>
           <w:color w:val="000000"/>
         </w:rPr>
         <w:t>B. Màn hình ≤ 768px</w:t>
@@ -9738,97 +10711,103 @@
           <w:b/>
           <w:color w:val="000000"/>
         </w:rPr>
+        <w:t>Phần 2:</w:t>
+      </w:r>
+      <w:r>
+        <w:rPr>
+          <w:rFonts w:ascii="inter" w:eastAsia="inter" w:hAnsi="inter" w:cs="inter"/>
+          <w:color w:val="000000"/>
+        </w:rPr>
+        <w:br/>
+        <w:t xml:space="preserve">3. </w:t>
+      </w:r>
+      <w:r>
+        <w:rPr>
+          <w:rFonts w:ascii="inter" w:eastAsia="inter" w:hAnsi="inter" w:cs="inter"/>
+          <w:b/>
+          <w:color w:val="000000"/>
+        </w:rPr>
+        <w:t>A</w:t>
+      </w:r>
+      <w:r>
+        <w:rPr>
+          <w:rFonts w:ascii="inter" w:eastAsia="inter" w:hAnsi="inter" w:cs="inter"/>
+          <w:color w:val="000000"/>
+        </w:rPr>
+        <w:t xml:space="preserve"> - Width bao gồm content + padding + border</w:t>
+      </w:r>
+      <w:r>
+        <w:rPr>
+          <w:rFonts w:ascii="inter" w:eastAsia="inter" w:hAnsi="inter" w:cs="inter"/>
+          <w:color w:val="000000"/>
+        </w:rPr>
+        <w:br/>
+        <w:t xml:space="preserve">4. </w:t>
+      </w:r>
+      <w:r>
+        <w:rPr>
+          <w:rFonts w:ascii="inter" w:eastAsia="inter" w:hAnsi="inter" w:cs="inter"/>
+          <w:b/>
+          <w:color w:val="000000"/>
+        </w:rPr>
+        <w:t>A</w:t>
+      </w:r>
+      <w:r>
+        <w:rPr>
+          <w:rFonts w:ascii="inter" w:eastAsia="inter" w:hAnsi="inter" w:cs="inter"/>
+          <w:color w:val="000000"/>
+        </w:rPr>
+        <w:t xml:space="preserve"> - Content → Padding → Border → Margin</w:t>
+      </w:r>
+    </w:p>
+    <w:p>
+      <w:pPr>
+        <w:spacing w:after="210" w:line="360" w:lineRule="auto"/>
+      </w:pPr>
+      <w:r>
+        <w:rPr>
+          <w:rFonts w:ascii="inter" w:eastAsia="inter" w:hAnsi="inter" w:cs="inter"/>
+          <w:b/>
+          <w:color w:val="000000"/>
+        </w:rPr>
+        <w:t>Phần 3:</w:t>
+      </w:r>
+      <w:r>
+        <w:rPr>
+          <w:rFonts w:ascii="inter" w:eastAsia="inter" w:hAnsi="inter" w:cs="inter"/>
+          <w:color w:val="000000"/>
+        </w:rPr>
+        <w:br/>
+        <w:t xml:space="preserve">5. </w:t>
+      </w:r>
+      <w:r>
+        <w:rPr>
+          <w:rFonts w:ascii="inter" w:eastAsia="inter" w:hAnsi="inter" w:cs="inter"/>
+          <w:b/>
+          <w:color w:val="000000"/>
+        </w:rPr>
+        <w:t>A</w:t>
+      </w:r>
+      <w:r>
+        <w:rPr>
+          <w:rFonts w:ascii="inter" w:eastAsia="inter" w:hAnsi="inter" w:cs="inter"/>
+          <w:color w:val="000000"/>
+        </w:rPr>
+        <w:t xml:space="preserve"> - 1 chiều (hàng hoặc cột)</w:t>
+      </w:r>
+      <w:r>
+        <w:rPr>
+          <w:rFonts w:ascii="inter" w:eastAsia="inter" w:hAnsi="inter" w:cs="inter"/>
+          <w:color w:val="000000"/>
+        </w:rPr>
+        <w:br/>
+      </w:r>
+      <w:r>
+        <w:rPr>
+          <w:rFonts w:ascii="inter" w:eastAsia="inter" w:hAnsi="inter" w:cs="inter"/>
+          <w:color w:val="000000"/>
+        </w:rPr>
         <w:lastRenderedPageBreak/>
-        <w:t>Phần 2:</w:t>
-      </w:r>
-      <w:r>
-        <w:rPr>
-          <w:rFonts w:ascii="inter" w:eastAsia="inter" w:hAnsi="inter" w:cs="inter"/>
-          <w:color w:val="000000"/>
-        </w:rPr>
-        <w:br/>
-        <w:t xml:space="preserve">3. </w:t>
-      </w:r>
-      <w:r>
-        <w:rPr>
-          <w:rFonts w:ascii="inter" w:eastAsia="inter" w:hAnsi="inter" w:cs="inter"/>
-          <w:b/>
-          <w:color w:val="000000"/>
-        </w:rPr>
-        <w:t>A</w:t>
-      </w:r>
-      <w:r>
-        <w:rPr>
-          <w:rFonts w:ascii="inter" w:eastAsia="inter" w:hAnsi="inter" w:cs="inter"/>
-          <w:color w:val="000000"/>
-        </w:rPr>
-        <w:t xml:space="preserve"> - Width bao gồm content + padding + border</w:t>
-      </w:r>
-      <w:r>
-        <w:rPr>
-          <w:rFonts w:ascii="inter" w:eastAsia="inter" w:hAnsi="inter" w:cs="inter"/>
-          <w:color w:val="000000"/>
-        </w:rPr>
-        <w:br/>
-        <w:t xml:space="preserve">4. </w:t>
-      </w:r>
-      <w:r>
-        <w:rPr>
-          <w:rFonts w:ascii="inter" w:eastAsia="inter" w:hAnsi="inter" w:cs="inter"/>
-          <w:b/>
-          <w:color w:val="000000"/>
-        </w:rPr>
-        <w:t>A</w:t>
-      </w:r>
-      <w:r>
-        <w:rPr>
-          <w:rFonts w:ascii="inter" w:eastAsia="inter" w:hAnsi="inter" w:cs="inter"/>
-          <w:color w:val="000000"/>
-        </w:rPr>
-        <w:t xml:space="preserve"> - Content → Padding → Border → Margin</w:t>
-      </w:r>
-    </w:p>
-    <w:p>
-      <w:pPr>
-        <w:spacing w:after="210" w:line="360" w:lineRule="auto"/>
-      </w:pPr>
-      <w:r>
-        <w:rPr>
-          <w:rFonts w:ascii="inter" w:eastAsia="inter" w:hAnsi="inter" w:cs="inter"/>
-          <w:b/>
-          <w:color w:val="000000"/>
-        </w:rPr>
-        <w:t>Phần 3:</w:t>
-      </w:r>
-      <w:r>
-        <w:rPr>
-          <w:rFonts w:ascii="inter" w:eastAsia="inter" w:hAnsi="inter" w:cs="inter"/>
-          <w:color w:val="000000"/>
-        </w:rPr>
-        <w:br/>
-        <w:t xml:space="preserve">5. </w:t>
-      </w:r>
-      <w:r>
-        <w:rPr>
-          <w:rFonts w:ascii="inter" w:eastAsia="inter" w:hAnsi="inter" w:cs="inter"/>
-          <w:b/>
-          <w:color w:val="000000"/>
-        </w:rPr>
-        <w:t>A</w:t>
-      </w:r>
-      <w:r>
-        <w:rPr>
-          <w:rFonts w:ascii="inter" w:eastAsia="inter" w:hAnsi="inter" w:cs="inter"/>
-          <w:color w:val="000000"/>
-        </w:rPr>
-        <w:t xml:space="preserve"> - 1 chiều (hàng hoặc cột)</w:t>
-      </w:r>
-      <w:r>
-        <w:rPr>
-          <w:rFonts w:ascii="inter" w:eastAsia="inter" w:hAnsi="inter" w:cs="inter"/>
-          <w:color w:val="000000"/>
-        </w:rPr>
-        <w:br/>
         <w:t xml:space="preserve">6. </w:t>
       </w:r>
       <w:r>
@@ -9996,7 +10975,7 @@
           <w:rFonts w:ascii="inter" w:eastAsia="inter" w:hAnsi="inter" w:cs="inter"/>
           <w:color w:val="000000"/>
         </w:rPr>
-        <w:t>________________________________</w:t>
+        <w:t>cơ bản về css</w:t>
       </w:r>
     </w:p>
     <w:p>
@@ -10012,7 +10991,7 @@
           <w:rFonts w:ascii="inter" w:eastAsia="inter" w:hAnsi="inter" w:cs="inter"/>
           <w:color w:val="000000"/>
         </w:rPr>
-        <w:t>________________________________</w:t>
+        <w:t>box-model</w:t>
       </w:r>
     </w:p>
     <w:p>
@@ -10028,7 +11007,7 @@
           <w:rFonts w:ascii="inter" w:eastAsia="inter" w:hAnsi="inter" w:cs="inter"/>
           <w:color w:val="000000"/>
         </w:rPr>
-        <w:t>________________________________</w:t>
+        <w:t>flex-box</w:t>
       </w:r>
     </w:p>
     <w:p>
@@ -10057,11 +11036,7 @@
         <w:spacing w:before="105" w:after="105" w:line="360" w:lineRule="auto"/>
       </w:pPr>
       <w:r>
-        <w:rPr>
-          <w:rFonts w:ascii="inter" w:eastAsia="inter" w:hAnsi="inter" w:cs="inter"/>
-          <w:color w:val="000000"/>
-        </w:rPr>
-        <w:t>________________________________</w:t>
+        <w:t>grid</w:t>
       </w:r>
     </w:p>
     <w:p>
@@ -10106,7 +11081,28 @@
           <w:rFonts w:ascii="inter" w:eastAsia="inter" w:hAnsi="inter" w:cs="inter"/>
           <w:color w:val="000000"/>
         </w:rPr>
-        <w:t>________________________________</w:t>
+        <w:t>Học js</w:t>
+      </w:r>
+      <w:r>
+        <w:rPr>
+          <w:rFonts w:ascii="inter" w:eastAsia="inter" w:hAnsi="inter" w:cs="inter"/>
+          <w:color w:val="000000"/>
+        </w:rPr>
+        <w:t>,</w:t>
+      </w:r>
+      <w:r>
+        <w:rPr>
+          <w:rFonts w:ascii="inter" w:eastAsia="inter" w:hAnsi="inter" w:cs="inter"/>
+          <w:color w:val="000000"/>
+        </w:rPr>
+        <w:t xml:space="preserve"> ôn lại html + css</w:t>
+      </w:r>
+      <w:r>
+        <w:rPr>
+          <w:rFonts w:ascii="inter" w:eastAsia="inter" w:hAnsi="inter" w:cs="inter"/>
+          <w:color w:val="000000"/>
+        </w:rPr>
+        <w:t>.</w:t>
       </w:r>
     </w:p>
     <w:p>

</xml_diff>